<commit_message>
feat: species max worker settings, drop page 5 of pre-feasibility doc
</commit_message>
<xml_diff>
--- a/assets/feasibility_v3_template.docx
+++ b/assets/feasibility_v3_template.docx
@@ -3133,196 +3133,6 @@
         </w:p>
       </w:sdtContent>
     </w:sdt>
-    <w:p>
-      <w:pPr>
-        <w:jc w:val="left"/>
-        <w:rPr>
-          <w:color w:val="000000"/>
-          <w:sz w:val="20"/>
-          <w:szCs w:val="20"/>
-        </w:rPr>
-      </w:pPr>
-      <w:r>
-        <w:br w:type="page"/>
-      </w:r>
-      <w:r>
-        <w:rPr>
-          <w:rtl w:val="0"/>
-        </w:rPr>
-      </w:r>
-    </w:p>
-    <w:p>
-      <w:pPr>
-        <w:spacing w:after="80" w:before="40" w:lineRule="auto"/>
-        <w:jc w:val="left"/>
-        <w:rPr>
-          <w:color w:val="000000"/>
-        </w:rPr>
-      </w:pPr>
-      <w:r>
-        <w:rPr>
-          <w:b w:val="1"/>
-          <w:bCs w:val="1"/>
-          <w:color w:val="000000"/>
-          <w:rtl w:val="0"/>
-        </w:rPr>
-        <w:t>Placeholder key — {{ t("Category: data point") }}</w:t>
-      </w:r>
-      <w:r>
-        <w:rPr>
-          <w:rtl w:val="0"/>
-        </w:rPr>
-      </w:r>
-    </w:p>
-    <w:p>
-      <w:pPr>
-        <w:pBdr>
-          <w:top w:color="d9d9d9" w:space="4" w:sz="4" w:val="single"/>
-          <w:left w:color="d9d9d9" w:space="4" w:sz="4" w:val="single"/>
-          <w:bottom w:color="d9d9d9" w:space="4" w:sz="4" w:val="single"/>
-          <w:right w:color="d9d9d9" w:space="4" w:sz="4" w:val="single"/>
-        </w:pBdr>
-        <w:spacing w:after="80" w:before="40" w:lineRule="auto"/>
-        <w:jc w:val="left"/>
-        <w:rPr/>
-      </w:pPr>
-      <w:r>
-        <w:rPr>
-          <w:b w:val="1"/>
-          <w:bCs w:val="1"/>
-          <w:color w:val="077f68"/>
-          <w:rtl w:val="0"/>
-        </w:rPr>
-        <w:t xml:space="preserve"> GUI pages </w:t>
-      </w:r>
-      <w:r>
-        <w:rPr>
-          <w:rtl w:val="0"/>
-        </w:rPr>
-        <w:t xml:space="preserve">   </w:t>
-      </w:r>
-      <w:r>
-        <w:rPr>
-          <w:color w:val="404040"/>
-          <w:rtl w:val="0"/>
-        </w:rPr>
-        <w:t xml:space="preserve">Site Characterisation, Threat, NbS Pathway, Nature, People, Climate, Potential Benefit</w:t>
-      </w:r>
-      <w:r>
-        <w:rPr>
-          <w:rtl w:val="0"/>
-        </w:rPr>
-      </w:r>
-    </w:p>
-    <w:p>
-      <w:pPr>
-        <w:pBdr>
-          <w:top w:color="d9d9d9" w:space="4" w:sz="4" w:val="single"/>
-          <w:left w:color="d9d9d9" w:space="4" w:sz="4" w:val="single"/>
-          <w:bottom w:color="d9d9d9" w:space="4" w:sz="4" w:val="single"/>
-          <w:right w:color="d9d9d9" w:space="4" w:sz="4" w:val="single"/>
-        </w:pBdr>
-        <w:spacing w:after="80" w:before="40" w:lineRule="auto"/>
-        <w:jc w:val="left"/>
-        <w:rPr/>
-      </w:pPr>
-      <w:r>
-        <w:rPr>
-          <w:b w:val="1"/>
-          <w:bCs w:val="1"/>
-          <w:color w:val="c55a11"/>
-          <w:rtl w:val="0"/>
-        </w:rPr>
-        <w:t xml:space="preserve"> </w:t>
-      </w:r>
-      <w:r>
-        <w:rPr>
-          <w:b w:val="1"/>
-          <w:bCs w:val="1"/>
-          <w:rtl w:val="0"/>
-        </w:rPr>
-        <w:t xml:space="preserve">Form Generator </w:t>
-      </w:r>
-      <w:r>
-        <w:rPr>
-          <w:rtl w:val="0"/>
-        </w:rPr>
-        <w:t xml:space="preserve">   </w:t>
-      </w:r>
-      <w:r>
-        <w:rPr>
-          <w:color w:val="404040"/>
-          <w:rtl w:val="0"/>
-        </w:rPr>
-        <w:t xml:space="preserve">People / socio-economic data auto-filled from standardised (cross-country) datasets</w:t>
-      </w:r>
-      <w:r>
-        <w:rPr>
-          <w:rtl w:val="0"/>
-        </w:rPr>
-      </w:r>
-    </w:p>
-    <w:p>
-      <w:pPr>
-        <w:pBdr>
-          <w:top w:color="d9d9d9" w:space="4" w:sz="4" w:val="single"/>
-          <w:left w:color="d9d9d9" w:space="4" w:sz="4" w:val="single"/>
-          <w:bottom w:color="d9d9d9" w:space="4" w:sz="4" w:val="single"/>
-          <w:right w:color="d9d9d9" w:space="4" w:sz="4" w:val="single"/>
-        </w:pBdr>
-        <w:spacing w:after="80" w:before="40" w:lineRule="auto"/>
-        <w:jc w:val="left"/>
-        <w:rPr/>
-      </w:pPr>
-      <w:r>
-        <w:rPr>
-          <w:b w:val="1"/>
-          <w:bCs w:val="1"/>
-          <w:color w:val="c00000"/>
-          <w:rtl w:val="0"/>
-        </w:rPr>
-        <w:t xml:space="preserve"> User input </w:t>
-      </w:r>
-      <w:r>
-        <w:rPr>
-          <w:rtl w:val="0"/>
-        </w:rPr>
-        <w:t xml:space="preserve">   </w:t>
-      </w:r>
-      <w:r>
-        <w:rPr>
-          <w:color w:val="404040"/>
-          <w:rtl w:val="0"/>
-        </w:rPr>
-        <w:t xml:space="preserve">site-specific data the user must supply, or not yet available</w:t>
-      </w:r>
-      <w:r>
-        <w:rPr>
-          <w:rtl w:val="0"/>
-        </w:rPr>
-      </w:r>
-    </w:p>
-    <w:p>
-      <w:pPr>
-        <w:spacing w:after="80" w:before="40" w:lineRule="auto"/>
-        <w:jc w:val="left"/>
-        <w:rPr/>
-      </w:pPr>
-      <w:r>
-        <w:rPr>
-          <w:i w:val="1"/>
-          <w:iCs w:val="1"/>
-          <w:color w:val="666666"/>
-          <w:rtl w:val="0"/>
-        </w:rPr>
-        <w:t xml:space="preserve">Sources — Site Characterisation: doc (16) · Threat: (11) · NbS Pathway: (12) · Nature/People/Climate/Potential Benefit: (13) · Form Generator: NBS-v3-GUI-001_GUI Design Document NBS Tool v3 (15).docx</w:t>
-      </w:r>
-      <w:r>
-        <w:rPr>
-          <w:rtl w:val="0"/>
-        </w:rPr>
-      </w:r>
-    </w:p>
     <w:p>
       <w:pPr>
         <w:spacing w:after="60" w:before="120" w:lineRule="auto"/>

</xml_diff>